<commit_message>
fix(setup): auto-create read-only DB account and .env so a fresh clone runs
</commit_message>
<xml_diff>
--- a/docs/PROG2002_A2_Report_Template.docx
+++ b/docs/PROG2002_A2_Report_Template.docx
@@ -98,35 +98,7 @@
             <w:rStyle w:val="aff9"/>
             <w:sz w:val="20"/>
           </w:rPr>
-          <w:t>https://github.co</w:t>
-        </w:r>
-        <w:r>
-          <w:rPr>
-            <w:rStyle w:val="aff9"/>
-            <w:sz w:val="20"/>
-          </w:rPr>
-          <w:t>m</w:t>
-        </w:r>
-        <w:r>
-          <w:rPr>
-            <w:rStyle w:val="aff9"/>
-            <w:sz w:val="20"/>
-          </w:rPr>
-          <w:t>/Ehoc-Walden/prog20</w:t>
-        </w:r>
-        <w:r>
-          <w:rPr>
-            <w:rStyle w:val="aff9"/>
-            <w:sz w:val="20"/>
-          </w:rPr>
-          <w:t>0</w:t>
-        </w:r>
-        <w:r>
-          <w:rPr>
-            <w:rStyle w:val="aff9"/>
-            <w:sz w:val="20"/>
-          </w:rPr>
-          <w:t>2-charity-events</w:t>
+          <w:t>https://github.com/Ehoc-Walden/prog2002-charity-events</w:t>
         </w:r>
       </w:hyperlink>
     </w:p>
@@ -134,7 +106,7 @@
       <w:pPr>
         <w:spacing w:after="80" w:line="264" w:lineRule="auto"/>
         <w:rPr>
-          <w:rFonts w:eastAsia="宋体" w:hint="eastAsia"/>
+          <w:rFonts w:eastAsia="宋体"/>
           <w:sz w:val="20"/>
           <w:lang w:eastAsia="zh-CN"/>
         </w:rPr>
@@ -142,6 +114,7 @@
       <w:r>
         <w:rPr>
           <w:rFonts w:eastAsia="宋体"/>
+          <w:noProof/>
           <w:sz w:val="20"/>
           <w:lang w:eastAsia="zh-CN"/>
         </w:rPr>
@@ -222,6 +195,7 @@
     <w:p>
       <w:pPr>
         <w:pStyle w:val="1"/>
+        <w:ind w:firstLineChars="100" w:firstLine="241"/>
       </w:pPr>
       <w:r>
         <w:lastRenderedPageBreak/>
@@ -4576,7 +4550,7 @@
     <w:p>
       <w:pPr>
         <w:rPr>
-          <w:rFonts w:eastAsia="宋体" w:hint="eastAsia"/>
+          <w:rFonts w:eastAsia="宋体"/>
           <w:lang w:eastAsia="zh-CN"/>
         </w:rPr>
       </w:pPr>
@@ -6301,7 +6275,7 @@
     </w:p>
     <w:p>
       <w:r>
-        <w:t>PowerShell does not accept the "&lt;" operator for input redirection, so SOURCE is used instead. If MySQL is installed elsewhere, change the $mysql path. schema.sql drops and recreates the charityevents_db database and its five tables (organisations, categories, venues, events and event_highlights); seed.sql then loads 4 organisations, 8 categories, 10 venues, 12 events and 33 event highlights.</w:t>
+        <w:t>PowerShell does not accept the "&lt;" operator for input redirection, so SOURCE is used instead. If MySQL is installed elsewhere, change the $mysql path. schema.sql drops and recreates the charityevents_db database and its five tables (organisations, categories, venues, events and event_highlights); seed.sql then loads 4 organisations, 8 categories, 10 venues, 12 events and 33 event highlights. In addition, schema.sql creates the read-only charity_app MySQL account that the API logs in with, so no manual MySQL user setup is required.</w:t>
       </w:r>
     </w:p>
     <w:p>
@@ -6345,7 +6319,7 @@
         <w:keepNext/>
       </w:pPr>
       <w:r>
-        <w:t>In the same PowerShell window, run:</w:t>
+        <w:t>No manual configuration is required. The API creates api/.env from api/.env.example automatically the first time it starts, with these defaults:</w:t>
       </w:r>
     </w:p>
     <w:p>
@@ -6361,7 +6335,7 @@
           <w:sz w:val="18"/>
           <w:highlight w:val="yellow"/>
         </w:rPr>
-        <w:t>Set-Location api</w:t>
+        <w:t>DB_HOST=localhost</w:t>
       </w:r>
       <w:r>
         <w:rPr>
@@ -6371,7 +6345,7 @@
           <w:highlight w:val="yellow"/>
         </w:rPr>
         <w:br/>
-        <w:t>Copy-Item .env.example .env</w:t>
+        <w:t>DB_PORT=3306</w:t>
       </w:r>
       <w:r>
         <w:rPr>
@@ -6381,23 +6355,8 @@
           <w:highlight w:val="yellow"/>
         </w:rPr>
         <w:br/>
-        <w:t>notepad .env</w:t>
-      </w:r>
-    </w:p>
-    <w:p>
-      <w:pPr>
-        <w:keepNext/>
-      </w:pPr>
-      <w:r>
-        <w:t>Set the values in .env as follows:</w:t>
-      </w:r>
-    </w:p>
-    <w:p>
-      <w:pPr>
-        <w:keepLines/>
-        <w:spacing w:before="80" w:after="160"/>
-        <w:ind w:left="173"/>
-      </w:pPr>
+        <w:t>DB_USER=charity_app</w:t>
+      </w:r>
       <w:r>
         <w:rPr>
           <w:rFonts w:ascii="Consolas" w:hAnsi="Consolas"/>
@@ -6405,7 +6364,8 @@
           <w:sz w:val="18"/>
           <w:highlight w:val="yellow"/>
         </w:rPr>
-        <w:t>DB_HOST=localhost</w:t>
+        <w:br/>
+        <w:t>DB_PASSWORD=change_me</w:t>
       </w:r>
       <w:r>
         <w:rPr>
@@ -6415,7 +6375,7 @@
           <w:highlight w:val="yellow"/>
         </w:rPr>
         <w:br/>
-        <w:t>DB_PORT=3306</w:t>
+        <w:t>DB_NAME=charityevents_db</w:t>
       </w:r>
       <w:r>
         <w:rPr>
@@ -6425,7 +6385,7 @@
           <w:highlight w:val="yellow"/>
         </w:rPr>
         <w:br/>
-        <w:t>DB_USER=root</w:t>
+        <w:t>PORT=3000</w:t>
       </w:r>
       <w:r>
         <w:rPr>
@@ -6435,102 +6395,28 @@
           <w:highlight w:val="yellow"/>
         </w:rPr>
         <w:br/>
-        <w:t>DB_PASSWORD=your_mysql_password</w:t>
-      </w:r>
-      <w:r>
-        <w:rPr>
-          <w:rFonts w:ascii="Consolas" w:hAnsi="Consolas"/>
-          <w:color w:val="1B2B34"/>
-          <w:sz w:val="18"/>
-          <w:highlight w:val="yellow"/>
-        </w:rPr>
-        <w:br/>
-        <w:t>DB_NAME=charityevents_db</w:t>
-      </w:r>
-      <w:r>
-        <w:rPr>
-          <w:rFonts w:ascii="Consolas" w:hAnsi="Consolas"/>
-          <w:color w:val="1B2B34"/>
-          <w:sz w:val="18"/>
-          <w:highlight w:val="yellow"/>
-        </w:rPr>
-        <w:br/>
-        <w:t>PORT=3000</w:t>
-      </w:r>
-      <w:r>
-        <w:rPr>
-          <w:rFonts w:ascii="Consolas" w:hAnsi="Consolas"/>
-          <w:color w:val="1B2B34"/>
-          <w:sz w:val="18"/>
-          <w:highlight w:val="yellow"/>
-        </w:rPr>
-        <w:br/>
         <w:t>CORS_ORIGINS=http://localhost:5500,http://127.0.0.1:5500</w:t>
       </w:r>
     </w:p>
     <w:p>
       <w:r>
-        <w:t>Important: .env.example suggests the account charity_app, but schema.sql does not create it. For the quickest run, set DB_USER=root and DB_PASSWORD to your own MySQL root password. The API only ever issues SELECT statements, so a read-</w:t>
-      </w:r>
-      <w:r>
-        <w:lastRenderedPageBreak/>
-        <w:t>only application account is sufficient. If you prefer that dedicated account, run the following once as an administrator:</w:t>
-      </w:r>
+        <w:t>The account charity_app is a read-only account that schema.sql creates when it is run as an administrator, so nothing has to be created by hand. The API only ever issues SELECT statements. To change the port or use a different MySQL login, edit api/.env and restart the API. If your MySQL login cannot create users, only the account block at the end of schema.sql fails; in that case set DB_USER=root and DB_PASSWORD to your own password in api/.env.</w:t>
+      </w:r>
+      <w:r/>
     </w:p>
     <w:p>
       <w:pPr>
-        <w:keepLines/>
-        <w:spacing w:before="80" w:after="160"/>
-        <w:ind w:left="173"/>
-      </w:pPr>
-      <w:r>
-        <w:rPr>
-          <w:rFonts w:ascii="Consolas" w:hAnsi="Consolas"/>
-          <w:color w:val="1B2B34"/>
-          <w:sz w:val="18"/>
-          <w:highlight w:val="yellow"/>
-        </w:rPr>
-        <w:t>CREATE USER 'charity_app'@'localhost' IDENTIFIED BY 'change_me';</w:t>
-      </w:r>
-      <w:r>
-        <w:rPr>
-          <w:rFonts w:ascii="Consolas" w:hAnsi="Consolas"/>
-          <w:color w:val="1B2B34"/>
-          <w:sz w:val="18"/>
-          <w:highlight w:val="yellow"/>
-        </w:rPr>
-        <w:br/>
-        <w:t>GRANT SELECT ON charityevents_db.* TO 'charity_app'@'localhost';</w:t>
-      </w:r>
-      <w:r>
-        <w:rPr>
-          <w:rFonts w:ascii="Consolas" w:hAnsi="Consolas"/>
-          <w:color w:val="1B2B34"/>
-          <w:sz w:val="18"/>
-          <w:highlight w:val="yellow"/>
-        </w:rPr>
-        <w:br/>
-        <w:t>FLUSH PRIVILEGES;</w:t>
+        <w:pStyle w:val="21"/>
+      </w:pPr>
+      <w:r>
+        <w:t>B.4 Install and start the API</w:t>
       </w:r>
     </w:p>
     <w:p>
-      <w:r>
-        <w:t>If you use that account, set DB_USER=charity_app and DB_PASSWORD=change_me in .env.</w:t>
-      </w:r>
-    </w:p>
-    <w:p>
-      <w:pPr>
-        <w:pStyle w:val="21"/>
-      </w:pPr>
-      <w:r>
-        <w:t>B.4 Install and start the API</w:t>
-      </w:r>
-    </w:p>
-    <w:p>
       <w:pPr>
         <w:keepNext/>
         <w:rPr>
-          <w:rFonts w:eastAsia="宋体" w:hint="eastAsia"/>
+          <w:rFonts w:eastAsia="宋体"/>
           <w:lang w:eastAsia="zh-CN"/>
         </w:rPr>
       </w:pPr>
@@ -6545,39 +6431,6 @@
       <w:r>
         <w:t xml:space="preserve"> folder, install the dependencies and start the server:</w:t>
       </w:r>
-    </w:p>
-    <w:p>
-      <w:pPr>
-        <w:keepLines/>
-        <w:spacing w:before="80" w:after="160"/>
-        <w:rPr>
-          <w:rFonts w:ascii="Consolas" w:eastAsia="宋体" w:hAnsi="Consolas" w:hint="eastAsia"/>
-          <w:color w:val="1B2B34"/>
-          <w:sz w:val="18"/>
-          <w:highlight w:val="yellow"/>
-          <w:lang w:eastAsia="zh-CN"/>
-        </w:rPr>
-      </w:pPr>
-      <w:r>
-        <w:rPr>
-          <w:rFonts w:ascii="Consolas" w:hAnsi="Consolas"/>
-          <w:color w:val="1B2B34"/>
-          <w:sz w:val="18"/>
-          <w:highlight w:val="yellow"/>
-        </w:rPr>
-        <w:t xml:space="preserve">cd </w:t>
-      </w:r>
-      <w:proofErr w:type="spellStart"/>
-      <w:r>
-        <w:rPr>
-          <w:rFonts w:ascii="Consolas" w:hAnsi="Consolas"/>
-          <w:color w:val="1B2B34"/>
-          <w:sz w:val="18"/>
-          <w:highlight w:val="yellow"/>
-        </w:rPr>
-        <w:t>api</w:t>
-      </w:r>
-      <w:proofErr w:type="spellEnd"/>
     </w:p>
     <w:p>
       <w:pPr>
@@ -6591,7 +6444,6 @@
           <w:lang w:eastAsia="zh-CN"/>
         </w:rPr>
       </w:pPr>
-      <w:proofErr w:type="spellStart"/>
       <w:r>
         <w:rPr>
           <w:rFonts w:ascii="Consolas" w:hAnsi="Consolas"/>
@@ -6599,9 +6451,9 @@
           <w:sz w:val="18"/>
           <w:highlight w:val="yellow"/>
         </w:rPr>
-        <w:t>npm</w:t>
-      </w:r>
-      <w:proofErr w:type="spellEnd"/>
+        <w:t xml:space="preserve">cd </w:t>
+      </w:r>
+      <w:proofErr w:type="spellStart"/>
       <w:r>
         <w:rPr>
           <w:rFonts w:ascii="Consolas" w:hAnsi="Consolas"/>
@@ -6609,17 +6461,20 @@
           <w:sz w:val="18"/>
           <w:highlight w:val="yellow"/>
         </w:rPr>
-        <w:t xml:space="preserve"> install</w:t>
-      </w:r>
+        <w:t>api</w:t>
+      </w:r>
+      <w:proofErr w:type="spellEnd"/>
     </w:p>
     <w:p>
       <w:pPr>
         <w:keepLines/>
         <w:spacing w:before="80" w:after="160"/>
         <w:rPr>
-          <w:rFonts w:ascii="Consolas" w:hAnsi="Consolas" w:hint="eastAsia"/>
+          <w:rFonts w:ascii="Consolas" w:eastAsia="宋体" w:hAnsi="Consolas"/>
           <w:color w:val="1B2B34"/>
           <w:sz w:val="18"/>
+          <w:highlight w:val="yellow"/>
+          <w:lang w:eastAsia="zh-CN"/>
         </w:rPr>
       </w:pPr>
       <w:proofErr w:type="spellStart"/>
@@ -6640,14 +6495,45 @@
           <w:sz w:val="18"/>
           <w:highlight w:val="yellow"/>
         </w:rPr>
-        <w:t xml:space="preserve"> start</w:t>
-      </w:r>
-      <w:r>
+        <w:t xml:space="preserve"> install</w:t>
+      </w:r>
+    </w:p>
+    <w:p>
+      <w:pPr>
+        <w:keepLines/>
+        <w:spacing w:before="80" w:after="160"/>
         <w:rPr>
           <w:rFonts w:ascii="Consolas" w:hAnsi="Consolas"/>
           <w:color w:val="1B2B34"/>
           <w:sz w:val="18"/>
         </w:rPr>
+      </w:pPr>
+      <w:proofErr w:type="spellStart"/>
+      <w:r>
+        <w:rPr>
+          <w:rFonts w:ascii="Consolas" w:hAnsi="Consolas"/>
+          <w:color w:val="1B2B34"/>
+          <w:sz w:val="18"/>
+          <w:highlight w:val="yellow"/>
+        </w:rPr>
+        <w:t>npm</w:t>
+      </w:r>
+      <w:proofErr w:type="spellEnd"/>
+      <w:r>
+        <w:rPr>
+          <w:rFonts w:ascii="Consolas" w:hAnsi="Consolas"/>
+          <w:color w:val="1B2B34"/>
+          <w:sz w:val="18"/>
+          <w:highlight w:val="yellow"/>
+        </w:rPr>
+        <w:t xml:space="preserve"> start</w:t>
+      </w:r>
+      <w:r>
+        <w:rPr>
+          <w:rFonts w:ascii="Consolas" w:hAnsi="Consolas"/>
+          <w:color w:val="1B2B34"/>
+          <w:sz w:val="18"/>
+        </w:rPr>
         <w:br/>
       </w:r>
     </w:p>
@@ -6678,7 +6564,7 @@
         <w:spacing w:before="80" w:after="160"/>
         <w:ind w:left="173"/>
         <w:rPr>
-          <w:rFonts w:eastAsia="宋体" w:hint="eastAsia"/>
+          <w:rFonts w:eastAsia="宋体"/>
           <w:lang w:eastAsia="zh-CN"/>
         </w:rPr>
       </w:pPr>
@@ -9404,6 +9290,7 @@
   <w:style w:type="character" w:default="1" w:styleId="a2">
     <w:name w:val="Default Paragraph Font"/>
     <w:uiPriority w:val="1"/>
+    <w:semiHidden/>
     <w:unhideWhenUsed/>
   </w:style>
   <w:style w:type="table" w:default="1" w:styleId="a3">

</xml_diff>